<commit_message>
refactor: restructure ESG report generation system into modular design and fix Windows encoding issues
</commit_message>
<xml_diff>
--- a/ESG REPORT/output/星光電子製造廠_ESG_Report_2025.docx
+++ b/ESG REPORT/output/星光電子製造廠_ESG_Report_2025.docx
@@ -52,7 +52,7 @@
         </w:rPr>
         <w:t>報告年度：2025 年度</w:t>
         <w:br/>
-        <w:t>報導核心：GRI 305 排放、GRI 404 培訓與教育</w:t>
+        <w:t>報導核心：多指標綜合永續報告書</w:t>
         <w:br/>
         <w:t>製表單位：ESG 企業永續發展小組</w:t>
         <w:br/>
@@ -96,21 +96,9 @@
         <w:br/>
         <w:t>二、 關於本報告書 ............................................................................................. 4</w:t>
         <w:br/>
-        <w:t>三、 GRI 305：溫室氣體排放量揭露 (Environmental) ..................................................... 5</w:t>
+        <w:t>三、 GRI 305：溫室氣體排放量揭露 (Emissions) ............................................................................ 5</w:t>
         <w:br/>
-        <w:t xml:space="preserve">     3.1.1 範疇一（直接溫室氣體排放）來源與數據深度解讀 ............................................ 5</w:t>
-        <w:br/>
-        <w:t xml:space="preserve">     3.1.2 範疇二（能源間接溫室氣體排放）外購電力分析與減量路徑 ................................. 5</w:t>
-        <w:br/>
-        <w:t xml:space="preserve">     3.1.3 年度排放變動率（YoY）與減量成效評估 ......................................................... 6</w:t>
-        <w:br/>
-        <w:t>四、 GRI 404：培訓與教育 (Social) ............................................................................ 7</w:t>
-        <w:br/>
-        <w:t xml:space="preserve">     4.1.1 員工平均培訓時數結構分析（依職級與性別） .................................................. 7</w:t>
-        <w:br/>
-        <w:t xml:space="preserve">     4.1.2 員工技能提升與過渡協助計畫執行效益 ............................................................ 7</w:t>
-        <w:br/>
-        <w:t xml:space="preserve">     4.1.3 組織人才穩定度與流動率指標解讀 .................................................................. 8</w:t>
+        <w:t>四、 GRI 404：培訓與教育 (Training &amp; Education) ............................................................................ 7</w:t>
         <w:br/>
         <w:t>附錄、 GRI 揭露指標索引對照表 .............................................................................. 9</w:t>
         <w:br/>
@@ -235,7 +223,7 @@
           <w:color w:val="2E7D32"/>
           <w:sz w:val="36"/>
         </w:rPr>
-        <w:t>三、 GRI 305：溫室氣體排放量揭露</w:t>
+        <w:t>七、 GRI 305：溫室氣體排放量揭露</w:t>
       </w:r>
     </w:p>
     <w:p>
@@ -266,152 +254,7 @@
           <w:color w:val="212121"/>
           <w:sz w:val="22"/>
         </w:rPr>
-        <w:t>星光電子製造廠2025年度溫室氣體排放報告書</w:t>
-      </w:r>
-    </w:p>
-    <w:p>
-      <w:pPr>
-        <w:spacing w:line="312" w:lineRule="auto" w:after="160"/>
-        <w:jc w:val="both"/>
-      </w:pPr>
-      <w:r>
-        <w:rPr>
-          <w:rFonts w:ascii="Arial" w:hAnsi="Arial"/>
-          <w:rFonts w:ascii="Arial" w:hAnsi="Arial" w:eastAsia="Microsoft JhengHei"/>
-          <w:color w:val="212121"/>
-          <w:sz w:val="22"/>
-        </w:rPr>
-      </w:r>
-    </w:p>
-    <w:p>
-      <w:pPr>
-        <w:spacing w:line="312" w:lineRule="auto" w:after="160"/>
-        <w:jc w:val="both"/>
-      </w:pPr>
-      <w:r>
-        <w:rPr>
-          <w:rFonts w:ascii="Arial" w:hAnsi="Arial"/>
-          <w:rFonts w:ascii="Arial" w:hAnsi="Arial" w:eastAsia="Microsoft JhengHei"/>
-          <w:color w:val="212121"/>
-          <w:sz w:val="22"/>
-        </w:rPr>
-        <w:t>3.1.1 範疇一（直接溫室氣體排放）來源與數據深度解讀</w:t>
-      </w:r>
-    </w:p>
-    <w:p>
-      <w:pPr>
-        <w:spacing w:line="312" w:lineRule="auto" w:after="160"/>
-        <w:jc w:val="both"/>
-      </w:pPr>
-      <w:r>
-        <w:rPr>
-          <w:rFonts w:ascii="Arial" w:hAnsi="Arial"/>
-          <w:rFonts w:ascii="Arial" w:hAnsi="Arial" w:eastAsia="Microsoft JhengHei"/>
-          <w:color w:val="212121"/>
-          <w:sz w:val="22"/>
-        </w:rPr>
-      </w:r>
-    </w:p>
-    <w:p>
-      <w:pPr>
-        <w:spacing w:line="312" w:lineRule="auto" w:after="160"/>
-        <w:jc w:val="both"/>
-      </w:pPr>
-      <w:r>
-        <w:rPr>
-          <w:rFonts w:ascii="Arial" w:hAnsi="Arial"/>
-          <w:rFonts w:ascii="Arial" w:hAnsi="Arial" w:eastAsia="Microsoft JhengHei"/>
-          <w:color w:val="212121"/>
-          <w:sz w:val="22"/>
-        </w:rPr>
-        <w:t>在星光電子製造廠2025年度，公司的直接溫室氣體排放總計為195.7千噸CO2等值。這個數字主要來自於柴油發電機和冷媒逸散兩大來源。</w:t>
-      </w:r>
-    </w:p>
-    <w:p>
-      <w:pPr>
-        <w:spacing w:line="312" w:lineRule="auto" w:after="160"/>
-        <w:jc w:val="both"/>
-      </w:pPr>
-      <w:r>
-        <w:rPr>
-          <w:rFonts w:ascii="Arial" w:hAnsi="Arial"/>
-          <w:rFonts w:ascii="Arial" w:hAnsi="Arial" w:eastAsia="Microsoft JhengHei"/>
-          <w:color w:val="212121"/>
-          <w:sz w:val="22"/>
-        </w:rPr>
-      </w:r>
-    </w:p>
-    <w:p>
-      <w:pPr>
-        <w:spacing w:line="312" w:lineRule="auto" w:after="160"/>
-        <w:jc w:val="both"/>
-      </w:pPr>
-      <w:r>
-        <w:rPr>
-          <w:rFonts w:ascii="Arial" w:hAnsi="Arial"/>
-          <w:rFonts w:ascii="Arial" w:hAnsi="Arial" w:eastAsia="Microsoft JhengHei"/>
-          <w:color w:val="212121"/>
-          <w:sz w:val="22"/>
-        </w:rPr>
-        <w:t>柴油發電機排放了150.5千噸CO2等值，占總計的76.6%。這些排放是由於生產過程中使用的柴油發電機所產生的溫室氣體排放。公司為了控制這些排放，實施了一系列措施，如維護柴油發電機的正常運行、進行定期檢查和保養，以減少溫室氣體排放。</w:t>
-      </w:r>
-    </w:p>
-    <w:p>
-      <w:pPr>
-        <w:spacing w:line="312" w:lineRule="auto" w:after="160"/>
-        <w:jc w:val="both"/>
-      </w:pPr>
-      <w:r>
-        <w:rPr>
-          <w:rFonts w:ascii="Arial" w:hAnsi="Arial"/>
-          <w:rFonts w:ascii="Arial" w:hAnsi="Arial" w:eastAsia="Microsoft JhengHei"/>
-          <w:color w:val="212121"/>
-          <w:sz w:val="22"/>
-        </w:rPr>
-      </w:r>
-    </w:p>
-    <w:p>
-      <w:pPr>
-        <w:spacing w:line="312" w:lineRule="auto" w:after="160"/>
-        <w:jc w:val="both"/>
-      </w:pPr>
-      <w:r>
-        <w:rPr>
-          <w:rFonts w:ascii="Arial" w:hAnsi="Arial"/>
-          <w:rFonts w:ascii="Arial" w:hAnsi="Arial" w:eastAsia="Microsoft JhengHei"/>
-          <w:color w:val="212121"/>
-          <w:sz w:val="22"/>
-        </w:rPr>
-        <w:t>冷媒逸散排放了45.2千噸CO2等值，占總計的23.1%。這些排放是由於生產過程中使用的冷媒所產生的溫室氣體排放。公司為了控制這些排放，實施了一系列措施，如設置溫室氣體監測系統、進行定期檢查和保養，以減少溫室氣體排放。</w:t>
-      </w:r>
-    </w:p>
-    <w:p>
-      <w:pPr>
-        <w:spacing w:line="312" w:lineRule="auto" w:after="160"/>
-        <w:jc w:val="both"/>
-      </w:pPr>
-      <w:r>
-        <w:rPr>
-          <w:rFonts w:ascii="Arial" w:hAnsi="Arial"/>
-          <w:rFonts w:ascii="Arial" w:hAnsi="Arial" w:eastAsia="Microsoft JhengHei"/>
-          <w:color w:val="212121"/>
-          <w:sz w:val="22"/>
-        </w:rPr>
-      </w:r>
-    </w:p>
-    <w:p>
-      <w:pPr>
-        <w:spacing w:line="312" w:lineRule="auto" w:after="160"/>
-        <w:jc w:val="both"/>
-      </w:pPr>
-      <w:r>
-        <w:rPr>
-          <w:rFonts w:ascii="Arial" w:hAnsi="Arial"/>
-          <w:rFonts w:ascii="Arial" w:hAnsi="Arial" w:eastAsia="Microsoft JhengHei"/>
-          <w:color w:val="212121"/>
-          <w:sz w:val="22"/>
-        </w:rPr>
-        <w:t>總計，星光電子製造廠2025年度的直接溫室氣體排放總計為195.7千噅CO2等值。</w:t>
+        <w:t>依據 GRI 305 溫室氣體排放揭露準則，星光電子製造廠 針對 2025 年度的直接溫室氣體排放（範疇一）進行了精準的盤查工作。 本公司的範疇一排放主要源自於營運廠區內的直接化石燃料燃燒與逸散源，經盤查明細包括：「柴油發電機」排放量為 150.5 公噸 CO2e, 「冷媒逸散」排放量為 45.2 公噸 CO2e。 範疇一合計直接排放量共計達到 195.7 公噸 CO2e。 本公司致力於源頭減量，已著手評估將老舊柴油發電機汰換為低排放機型，並定期實施冷媒洩漏檢測，確保範疇一直接排放量維持在最優化水平。</w:t>
       </w:r>
     </w:p>
     <w:p>
@@ -442,123 +285,7 @@
           <w:color w:val="212121"/>
           <w:sz w:val="22"/>
         </w:rPr>
-        <w:t>星光電子製造廠 2025 年企業永續報告書</w:t>
-      </w:r>
-    </w:p>
-    <w:p>
-      <w:pPr>
-        <w:spacing w:line="312" w:lineRule="auto" w:after="160"/>
-        <w:jc w:val="both"/>
-      </w:pPr>
-      <w:r>
-        <w:rPr>
-          <w:rFonts w:ascii="Arial" w:hAnsi="Arial"/>
-          <w:rFonts w:ascii="Arial" w:hAnsi="Arial" w:eastAsia="Microsoft JhengHei"/>
-          <w:color w:val="212121"/>
-          <w:sz w:val="22"/>
-        </w:rPr>
-      </w:r>
-    </w:p>
-    <w:p>
-      <w:pPr>
-        <w:spacing w:line="312" w:lineRule="auto" w:after="160"/>
-        <w:jc w:val="both"/>
-      </w:pPr>
-      <w:r>
-        <w:rPr>
-          <w:rFonts w:ascii="Arial" w:hAnsi="Arial"/>
-          <w:rFonts w:ascii="Arial" w:hAnsi="Arial" w:eastAsia="Microsoft JhengHei"/>
-          <w:color w:val="212121"/>
-          <w:sz w:val="22"/>
-        </w:rPr>
-        <w:t>範疇二（能源間接溫室氣體排放）外購電力分析與減碳路徑</w:t>
-      </w:r>
-    </w:p>
-    <w:p>
-      <w:pPr>
-        <w:spacing w:line="312" w:lineRule="auto" w:after="160"/>
-        <w:jc w:val="both"/>
-      </w:pPr>
-      <w:r>
-        <w:rPr>
-          <w:rFonts w:ascii="Arial" w:hAnsi="Arial"/>
-          <w:rFonts w:ascii="Arial" w:hAnsi="Arial" w:eastAsia="Microsoft JhengHei"/>
-          <w:color w:val="212121"/>
-          <w:sz w:val="22"/>
-        </w:rPr>
-      </w:r>
-    </w:p>
-    <w:p>
-      <w:pPr>
-        <w:spacing w:line="312" w:lineRule="auto" w:after="160"/>
-        <w:jc w:val="both"/>
-      </w:pPr>
-      <w:r>
-        <w:rPr>
-          <w:rFonts w:ascii="Arial" w:hAnsi="Arial"/>
-          <w:rFonts w:ascii="Arial" w:hAnsi="Arial" w:eastAsia="Microsoft JhengHei"/>
-          <w:color w:val="212121"/>
-          <w:sz w:val="22"/>
-        </w:rPr>
-        <w:t>根據星光電子製造廠 2025 年的環評數據，範疇二（能源間接溫室氣體排放）的主要來源為外購電力，占總溫室氣體排放的 94.2%。這項排放源的總量為 3250.8 萬噸 CO2 等效物質（tCO2e），是企業整體溫室氣體排放的 93.6%。</w:t>
-      </w:r>
-    </w:p>
-    <w:p>
-      <w:pPr>
-        <w:spacing w:line="312" w:lineRule="auto" w:after="160"/>
-        <w:jc w:val="both"/>
-      </w:pPr>
-      <w:r>
-        <w:rPr>
-          <w:rFonts w:ascii="Arial" w:hAnsi="Arial"/>
-          <w:rFonts w:ascii="Arial" w:hAnsi="Arial" w:eastAsia="Microsoft JhengHei"/>
-          <w:color w:val="212121"/>
-          <w:sz w:val="22"/>
-        </w:rPr>
-      </w:r>
-    </w:p>
-    <w:p>
-      <w:pPr>
-        <w:spacing w:line="312" w:lineRule="auto" w:after="160"/>
-        <w:jc w:val="both"/>
-      </w:pPr>
-      <w:r>
-        <w:rPr>
-          <w:rFonts w:ascii="Arial" w:hAnsi="Arial"/>
-          <w:rFonts w:ascii="Arial" w:hAnsi="Arial" w:eastAsia="Microsoft JhengHei"/>
-          <w:color w:val="212121"/>
-          <w:sz w:val="22"/>
-        </w:rPr>
-        <w:t>星光電子製造廠將繼續推進綠電採購規劃，透過與供應商協議，選擇可再生能源為主要電力來源。同時，公司也會繼續推進廠區節能設備改造，以減少非必要的電力消耗。智慧能源管理系統的實施將有助於監控和優化企業的能源使用效率。</w:t>
-      </w:r>
-    </w:p>
-    <w:p>
-      <w:pPr>
-        <w:spacing w:line="312" w:lineRule="auto" w:after="160"/>
-        <w:jc w:val="both"/>
-      </w:pPr>
-      <w:r>
-        <w:rPr>
-          <w:rFonts w:ascii="Arial" w:hAnsi="Arial"/>
-          <w:rFonts w:ascii="Arial" w:hAnsi="Arial" w:eastAsia="Microsoft JhengHei"/>
-          <w:color w:val="212121"/>
-          <w:sz w:val="22"/>
-        </w:rPr>
-      </w:r>
-    </w:p>
-    <w:p>
-      <w:pPr>
-        <w:spacing w:line="312" w:lineRule="auto" w:after="160"/>
-        <w:jc w:val="both"/>
-      </w:pPr>
-      <w:r>
-        <w:rPr>
-          <w:rFonts w:ascii="Arial" w:hAnsi="Arial"/>
-          <w:rFonts w:ascii="Arial" w:hAnsi="Arial" w:eastAsia="Microsoft JhengHei"/>
-          <w:color w:val="212121"/>
-          <w:sz w:val="22"/>
-        </w:rPr>
-        <w:t>在未來，星光電子製制造廠將繼續努力減少外購電力的溫室氣體排放量，並推進可再生能源使用，實現企業的環境承擔責任。</w:t>
+        <w:t>針對能源間接溫室氣體排放（範疇二），星光電子製造廠 於 2025 年度的排放源主要為營運廠區與辦公大樓之「外購電力」， 其外購電力間接碳排放量共計達 3250.8 公噸 CO2e。 由於外購電力占本公司整體溫室氣體排放量之大宗，電力能效的控制與減量為本公司綠色轉型的核心工作。 本公司目前正全面落實廠區照明與空調系統之節能改造，推廣智慧電網管理，並評估於廠區屋頂鋪設太陽能光電系統與採購再生能源憑證（綠電），以加速推動能源轉型，降低範疇二之環境負擔。</w:t>
       </w:r>
     </w:p>
     <w:p>
@@ -946,123 +673,7 @@
           <w:color w:val="212121"/>
           <w:sz w:val="22"/>
         </w:rPr>
-        <w:t>星光電子製造廠的2025年度排放變動率（YoY）與減量成效評估</w:t>
-      </w:r>
-    </w:p>
-    <w:p>
-      <w:pPr>
-        <w:spacing w:line="312" w:lineRule="auto" w:after="160"/>
-        <w:jc w:val="both"/>
-      </w:pPr>
-      <w:r>
-        <w:rPr>
-          <w:rFonts w:ascii="Arial" w:hAnsi="Arial"/>
-          <w:rFonts w:ascii="Arial" w:hAnsi="Arial" w:eastAsia="Microsoft JhengHei"/>
-          <w:color w:val="212121"/>
-          <w:sz w:val="22"/>
-        </w:rPr>
-      </w:r>
-    </w:p>
-    <w:p>
-      <w:pPr>
-        <w:spacing w:line="312" w:lineRule="auto" w:after="160"/>
-        <w:jc w:val="both"/>
-      </w:pPr>
-      <w:r>
-        <w:rPr>
-          <w:rFonts w:ascii="Arial" w:hAnsi="Arial"/>
-          <w:rFonts w:ascii="Arial" w:hAnsi="Arial" w:eastAsia="Microsoft JhengHei"/>
-          <w:color w:val="212121"/>
-          <w:sz w:val="22"/>
-        </w:rPr>
-        <w:t>根據星光電子製造廠於2025年實現的排放總量， Scope 1Direct 排放量為195.7噸CO2e，Scope 2Indirect 排放量為3250.8噸CO2e，合計總排放量為3446.5噸CO2e。</w:t>
-      </w:r>
-    </w:p>
-    <w:p>
-      <w:pPr>
-        <w:spacing w:line="312" w:lineRule="auto" w:after="160"/>
-        <w:jc w:val="both"/>
-      </w:pPr>
-      <w:r>
-        <w:rPr>
-          <w:rFonts w:ascii="Arial" w:hAnsi="Arial"/>
-          <w:rFonts w:ascii="Arial" w:hAnsi="Arial" w:eastAsia="Microsoft JhengHei"/>
-          <w:color w:val="212121"/>
-          <w:sz w:val="22"/>
-        </w:rPr>
-      </w:r>
-    </w:p>
-    <w:p>
-      <w:pPr>
-        <w:spacing w:line="312" w:lineRule="auto" w:after="160"/>
-        <w:jc w:val="both"/>
-      </w:pPr>
-      <w:r>
-        <w:rPr>
-          <w:rFonts w:ascii="Arial" w:hAnsi="Arial"/>
-          <w:rFonts w:ascii="Arial" w:hAnsi="Arial" w:eastAsia="Microsoft JhengHei"/>
-          <w:color w:val="212121"/>
-          <w:sz w:val="22"/>
-        </w:rPr>
-        <w:t>對於2024年度的基準值進行比較，星光電子製造廠於2025年度實現了3.5%的降低。這種降低是由於企業在2024年推行的減碳計畫，包括優化生產流程和使用可再生的能源等措施。</w:t>
-      </w:r>
-    </w:p>
-    <w:p>
-      <w:pPr>
-        <w:spacing w:line="312" w:lineRule="auto" w:after="160"/>
-        <w:jc w:val="both"/>
-      </w:pPr>
-      <w:r>
-        <w:rPr>
-          <w:rFonts w:ascii="Arial" w:hAnsi="Arial"/>
-          <w:rFonts w:ascii="Arial" w:hAnsi="Arial" w:eastAsia="Microsoft JhengHei"/>
-          <w:color w:val="212121"/>
-          <w:sz w:val="22"/>
-        </w:rPr>
-      </w:r>
-    </w:p>
-    <w:p>
-      <w:pPr>
-        <w:spacing w:line="312" w:lineRule="auto" w:after="160"/>
-        <w:jc w:val="both"/>
-      </w:pPr>
-      <w:r>
-        <w:rPr>
-          <w:rFonts w:ascii="Arial" w:hAnsi="Arial"/>
-          <w:rFonts w:ascii="Arial" w:hAnsi="Arial" w:eastAsia="Microsoft JhengHei"/>
-          <w:color w:val="212121"/>
-          <w:sz w:val="22"/>
-        </w:rPr>
-        <w:t>在2025年度，星光電子製造廠繼續強調減碳的重要性，並繼續推進減碳計畫。企業將繼續優化生產流程，實現更多的減排成效，並探索新技術和新能源來替代傳統能源。</w:t>
-      </w:r>
-    </w:p>
-    <w:p>
-      <w:pPr>
-        <w:spacing w:line="312" w:lineRule="auto" w:after="160"/>
-        <w:jc w:val="both"/>
-      </w:pPr>
-      <w:r>
-        <w:rPr>
-          <w:rFonts w:ascii="Arial" w:hAnsi="Arial"/>
-          <w:rFonts w:ascii="Arial" w:hAnsi="Arial" w:eastAsia="Microsoft JhengHei"/>
-          <w:color w:val="212121"/>
-          <w:sz w:val="22"/>
-        </w:rPr>
-      </w:r>
-    </w:p>
-    <w:p>
-      <w:pPr>
-        <w:spacing w:line="312" w:lineRule="auto" w:after="160"/>
-        <w:jc w:val="both"/>
-      </w:pPr>
-      <w:r>
-        <w:rPr>
-          <w:rFonts w:ascii="Arial" w:hAnsi="Arial"/>
-          <w:rFonts w:ascii="Arial" w:hAnsi="Arial" w:eastAsia="Microsoft JhengHei"/>
-          <w:color w:val="212121"/>
-          <w:sz w:val="22"/>
-        </w:rPr>
-        <w:t>總體而言，星光電子製造廠於2025年度實現了有效的減碳成效，這是由於企業的持續努力和願景的一部分。</w:t>
+        <w:t>在年度排放變動分析方面，星光電子製造廠 統計 2025 年度的範疇一與範疇二溫室氣體排放總量共計為 3446.5 公噸 CO2e。 相較於基準年度，排放總量減少了 3.5%，顯示本公司在落實能源節約與低碳營運轉型上取得實質進展。 此項減碳成效源自跨部門小組協同合作，積極推動節能製程改善及低碳材料導入。 本公司將持續深化低碳工藝的研發與再生能源之應用，健全低碳永續經營模式，朝向全球倡議之淨零碳排終極目標穩健前進。</w:t>
       </w:r>
     </w:p>
     <w:p>
@@ -1153,7 +764,7 @@
           <w:color w:val="2E7D32"/>
           <w:sz w:val="36"/>
         </w:rPr>
-        <w:t>四、 GRI 404：培訓與教育</w:t>
+        <w:t>十、 GRI 404：培訓與教育</w:t>
       </w:r>
     </w:p>
     <w:p>
@@ -1184,109 +795,7 @@
           <w:color w:val="212121"/>
           <w:sz w:val="22"/>
         </w:rPr>
-        <w:t>星光電子製造廠2025年社會責任報告書</w:t>
-      </w:r>
-    </w:p>
-    <w:p>
-      <w:pPr>
-        <w:spacing w:line="312" w:lineRule="auto" w:after="160"/>
-        <w:jc w:val="both"/>
-      </w:pPr>
-      <w:r>
-        <w:rPr>
-          <w:rFonts w:ascii="Arial" w:hAnsi="Arial"/>
-          <w:rFonts w:ascii="Arial" w:hAnsi="Arial" w:eastAsia="Microsoft JhengHei"/>
-          <w:color w:val="212121"/>
-          <w:sz w:val="22"/>
-        </w:rPr>
-        <w:t>4.1.1 員工平均培訓時數結構分析（依職級與性別）</w:t>
-      </w:r>
-    </w:p>
-    <w:p>
-      <w:pPr>
-        <w:spacing w:line="312" w:lineRule="auto" w:after="160"/>
-        <w:jc w:val="both"/>
-      </w:pPr>
-      <w:r>
-        <w:rPr>
-          <w:rFonts w:ascii="Arial" w:hAnsi="Arial"/>
-          <w:rFonts w:ascii="Arial" w:hAnsi="Arial" w:eastAsia="Microsoft JhengHei"/>
-          <w:color w:val="212121"/>
-          <w:sz w:val="22"/>
-        </w:rPr>
-      </w:r>
-    </w:p>
-    <w:p>
-      <w:pPr>
-        <w:spacing w:line="312" w:lineRule="auto" w:after="160"/>
-        <w:jc w:val="both"/>
-      </w:pPr>
-      <w:r>
-        <w:rPr>
-          <w:rFonts w:ascii="Arial" w:hAnsi="Arial"/>
-          <w:rFonts w:ascii="Arial" w:hAnsi="Arial" w:eastAsia="Microsoft JhengHei"/>
-          <w:color w:val="212121"/>
-          <w:sz w:val="22"/>
-        </w:rPr>
-        <w:t>星光電子製造廠對員工的培訓是長期的承諾，以確保其技能和知識的持續發展。根據2025年的統計，高階主管的平均培訓時數為45.0小時，中階主管為32.5小時，基層員工為28.0小時。整體而言，全體員工的平均培訓時數為30.2小時。</w:t>
-      </w:r>
-    </w:p>
-    <w:p>
-      <w:pPr>
-        <w:spacing w:line="312" w:lineRule="auto" w:after="160"/>
-        <w:jc w:val="both"/>
-      </w:pPr>
-      <w:r>
-        <w:rPr>
-          <w:rFonts w:ascii="Arial" w:hAnsi="Arial"/>
-          <w:rFonts w:ascii="Arial" w:hAnsi="Arial" w:eastAsia="Microsoft JhengHei"/>
-          <w:color w:val="212121"/>
-          <w:sz w:val="22"/>
-        </w:rPr>
-      </w:r>
-    </w:p>
-    <w:p>
-      <w:pPr>
-        <w:spacing w:line="312" w:lineRule="auto" w:after="160"/>
-        <w:jc w:val="both"/>
-      </w:pPr>
-      <w:r>
-        <w:rPr>
-          <w:rFonts w:ascii="Arial" w:hAnsi="Arial"/>
-          <w:rFonts w:ascii="Arial" w:hAnsi="Arial" w:eastAsia="Microsoft JhengHei"/>
-          <w:color w:val="212121"/>
-          <w:sz w:val="22"/>
-        </w:rPr>
-        <w:t>此外，星光電子製造廠還對不同性別員工的培訓進行了分析。男性員工的平均培訓時數為29.5小時，而女性員工則為31.0小時。在這兩個方面，星光電子製造廠的培訓結果表明了在教育資源分配上的均衡性。</w:t>
-      </w:r>
-    </w:p>
-    <w:p>
-      <w:pPr>
-        <w:spacing w:line="312" w:lineRule="auto" w:after="160"/>
-        <w:jc w:val="both"/>
-      </w:pPr>
-      <w:r>
-        <w:rPr>
-          <w:rFonts w:ascii="Arial" w:hAnsi="Arial"/>
-          <w:rFonts w:ascii="Arial" w:hAnsi="Arial" w:eastAsia="Microsoft JhengHei"/>
-          <w:color w:val="212121"/>
-          <w:sz w:val="22"/>
-        </w:rPr>
-      </w:r>
-    </w:p>
-    <w:p>
-      <w:pPr>
-        <w:spacing w:line="312" w:lineRule="auto" w:after="160"/>
-        <w:jc w:val="both"/>
-      </w:pPr>
-      <w:r>
-        <w:rPr>
-          <w:rFonts w:ascii="Arial" w:hAnsi="Arial"/>
-          <w:rFonts w:ascii="Arial" w:hAnsi="Arial" w:eastAsia="Microsoft JhengHei"/>
-          <w:color w:val="212121"/>
-          <w:sz w:val="22"/>
-        </w:rPr>
-        <w:t>星光電子製造廠繼續推進內部職涯能力培育，以滿足員工的需求和發展。同時，這些數據也反映了公司對於員工培訓的承諾和成果。</w:t>
+        <w:t>依據 GRI 404 培訓與教育揭露準則，星光電子製造廠 深信持續提升員工專業知能是企業成長的關鍵。 在 2025 年度員工平均培訓時數的結構分析中，數據顯示：「高階主管平均培訓時數」平均達 45.0 小時, 「中階主管平均培訓時數」平均達 32.5 小時, 「基層員工平均培訓時數」平均達 28.0 小時, 「男性員工平均培訓時數」平均達 29.5 小時, 「女性員工平均培訓時數」平均達 31.0 小時, 「全體員工平均培訓時數」平均達 30.2 小時。 本公司針對高階主管、中階主管以及基層員工，因應其工作範疇與管理層級之不同，提供相應的學程培訓，同時確保性別平權與資源分配的均等。 此數據充分顯現本公司在落實內部職涯技能輔導與組織核心能力建構上，皆維持高標準之投入。</w:t>
       </w:r>
     </w:p>
     <w:p>
@@ -1317,36 +826,7 @@
           <w:color w:val="212121"/>
           <w:sz w:val="22"/>
         </w:rPr>
-        <w:t>星光電子製造廠於2025年繼續推行持續的培訓課程及技能提升計畫，旨在幫助同仁因應數位轉型、AI 製程優化等職涯技能變動。根據統計資料，高階主管平均培訓時數為 45 小時，中階主管平均培訓時數為 32.5 小時，基層員工平均培訓時數為 28 小時。男性員工平均培訓時數為 29.5 小時，女性員工平均培訓時數為 31 小時。全體員工平均培訓時數為 30.2 小時。</w:t>
-      </w:r>
-    </w:p>
-    <w:p>
-      <w:pPr>
-        <w:spacing w:line="312" w:lineRule="auto" w:after="160"/>
-        <w:jc w:val="both"/>
-      </w:pPr>
-      <w:r>
-        <w:rPr>
-          <w:rFonts w:ascii="Arial" w:hAnsi="Arial"/>
-          <w:rFonts w:ascii="Arial" w:hAnsi="Arial" w:eastAsia="Microsoft JhengHei"/>
-          <w:color w:val="212121"/>
-          <w:sz w:val="22"/>
-        </w:rPr>
-      </w:r>
-    </w:p>
-    <w:p>
-      <w:pPr>
-        <w:spacing w:line="312" w:lineRule="auto" w:after="160"/>
-        <w:jc w:val="both"/>
-      </w:pPr>
-      <w:r>
-        <w:rPr>
-          <w:rFonts w:ascii="Arial" w:hAnsi="Arial"/>
-          <w:rFonts w:ascii="Arial" w:hAnsi="Arial" w:eastAsia="Microsoft JhengHei"/>
-          <w:color w:val="212121"/>
-          <w:sz w:val="22"/>
-        </w:rPr>
-        <w:t>此外，星光電子製造廠的培訓計畫也發揮了良好的效果，新進員工比率僅為 12.5%，員工離職率則為 8.4%。這種培訓與技能重建方案對組織韌性、長期留任與企業永續競爭力帶來了實質效益。</w:t>
+        <w:t>為配合科技進步與產業快速轉型，星光電子製造廠 於 2025 年度積極推展多元化的員工技能提升與過渡協助計畫。 我們除了舉辦內部專業工作坊、管理職特訓班之外，亦提供外部進修學費補助，以協助同仁在變動的市場中持續掌握前沿技能。 這些培訓與技能重建方案，性能激發同仁的自我實現潛能，更有助於縮短新技術導入的學習曲線，提升公司的營運彈性與長期永續競爭力。</w:t>
       </w:r>
     </w:p>
     <w:p>
@@ -1982,123 +1462,7 @@
           <w:color w:val="212121"/>
           <w:sz w:val="22"/>
         </w:rPr>
-        <w:t>星光電子製造廠2025年度企業社會責任報告書</w:t>
-      </w:r>
-    </w:p>
-    <w:p>
-      <w:pPr>
-        <w:spacing w:line="312" w:lineRule="auto" w:after="160"/>
-        <w:jc w:val="both"/>
-      </w:pPr>
-      <w:r>
-        <w:rPr>
-          <w:rFonts w:ascii="Arial" w:hAnsi="Arial"/>
-          <w:rFonts w:ascii="Arial" w:hAnsi="Arial" w:eastAsia="Microsoft JhengHei"/>
-          <w:color w:val="212121"/>
-          <w:sz w:val="22"/>
-        </w:rPr>
-      </w:r>
-    </w:p>
-    <w:p>
-      <w:pPr>
-        <w:spacing w:line="312" w:lineRule="auto" w:after="160"/>
-        <w:jc w:val="both"/>
-      </w:pPr>
-      <w:r>
-        <w:rPr>
-          <w:rFonts w:ascii="Arial" w:hAnsi="Arial"/>
-          <w:rFonts w:ascii="Arial" w:hAnsi="Arial" w:eastAsia="Microsoft JhengHei"/>
-          <w:color w:val="212121"/>
-          <w:sz w:val="22"/>
-        </w:rPr>
-        <w:t>4.1.3 組織人才穩定度與流動率指標解讀</w:t>
-      </w:r>
-    </w:p>
-    <w:p>
-      <w:pPr>
-        <w:spacing w:line="312" w:lineRule="auto" w:after="160"/>
-        <w:jc w:val="both"/>
-      </w:pPr>
-      <w:r>
-        <w:rPr>
-          <w:rFonts w:ascii="Arial" w:hAnsi="Arial"/>
-          <w:rFonts w:ascii="Arial" w:hAnsi="Arial" w:eastAsia="Microsoft JhengHei"/>
-          <w:color w:val="212121"/>
-          <w:sz w:val="22"/>
-        </w:rPr>
-      </w:r>
-    </w:p>
-    <w:p>
-      <w:pPr>
-        <w:spacing w:line="312" w:lineRule="auto" w:after="160"/>
-        <w:jc w:val="both"/>
-      </w:pPr>
-      <w:r>
-        <w:rPr>
-          <w:rFonts w:ascii="Arial" w:hAnsi="Arial"/>
-          <w:rFonts w:ascii="Arial" w:hAnsi="Arial" w:eastAsia="Microsoft JhengHei"/>
-          <w:color w:val="212121"/>
-          <w:sz w:val="22"/>
-        </w:rPr>
-        <w:t>星光電子製造廠強調人才培訓的重要性，旨在提高員工的技能和能力，以維持組織穩定度。根據2025年度的數據，公司的高階主管平均培訓時數為45小時、中階主管平均培訓時數為32.5小時，基層員工平均培訓時數為28小時。男性員工和女性員工的平均培訓時數分別為29.5小時和31小時，全體員工的平均培訓時數為30.2小時。</w:t>
-      </w:r>
-    </w:p>
-    <w:p>
-      <w:pPr>
-        <w:spacing w:line="312" w:lineRule="auto" w:after="160"/>
-        <w:jc w:val="both"/>
-      </w:pPr>
-      <w:r>
-        <w:rPr>
-          <w:rFonts w:ascii="Arial" w:hAnsi="Arial"/>
-          <w:rFonts w:ascii="Arial" w:hAnsi="Arial" w:eastAsia="Microsoft JhengHei"/>
-          <w:color w:val="212121"/>
-          <w:sz w:val="22"/>
-        </w:rPr>
-      </w:r>
-    </w:p>
-    <w:p>
-      <w:pPr>
-        <w:spacing w:line="312" w:lineRule="auto" w:after="160"/>
-        <w:jc w:val="both"/>
-      </w:pPr>
-      <w:r>
-        <w:rPr>
-          <w:rFonts w:ascii="Arial" w:hAnsi="Arial"/>
-          <w:rFonts w:ascii="Arial" w:hAnsi="Arial" w:eastAsia="Microsoft JhengHei"/>
-          <w:color w:val="212121"/>
-          <w:sz w:val="22"/>
-        </w:rPr>
-        <w:t>此外，星光電子製造廠也積極推進人才流動率指標的實施。2025年度的新進員工比率為12.5%，員工離職率為8.4%。這些數據表明公司的人才培訓和發展策略正在發揮積極作用，提高員工的技能和滿意度。</w:t>
-      </w:r>
-    </w:p>
-    <w:p>
-      <w:pPr>
-        <w:spacing w:line="312" w:lineRule="auto" w:after="160"/>
-        <w:jc w:val="both"/>
-      </w:pPr>
-      <w:r>
-        <w:rPr>
-          <w:rFonts w:ascii="Arial" w:hAnsi="Arial"/>
-          <w:rFonts w:ascii="Arial" w:hAnsi="Arial" w:eastAsia="Microsoft JhengHei"/>
-          <w:color w:val="212121"/>
-          <w:sz w:val="22"/>
-        </w:rPr>
-      </w:r>
-    </w:p>
-    <w:p>
-      <w:pPr>
-        <w:spacing w:line="312" w:lineRule="auto" w:after="160"/>
-        <w:jc w:val="both"/>
-      </w:pPr>
-      <w:r>
-        <w:rPr>
-          <w:rFonts w:ascii="Arial" w:hAnsi="Arial"/>
-          <w:rFonts w:ascii="Arial" w:hAnsi="Arial" w:eastAsia="Microsoft JhengHei"/>
-          <w:color w:val="212121"/>
-          <w:sz w:val="22"/>
-        </w:rPr>
-        <w:t>然而，這些指標也提醒我們需要繼續改善留才機制、升遷管道優化及友善職場工作氛圍，以降低員工流動率和提高組織穩定度。星光電子製造廠將繼續推進人才發展和管理的相關政策，提高員工的技能和滿意度，以實現長期營運效益。</w:t>
+        <w:t>在人力結構穩定度指標方面，星光電子製造廠 統計本報告年度之關鍵數據顯示：「新進員工比率」為 12.5%, 「員工離職率」為 8.4%。 本公司高度重視新進員工之融入狀況以及核心關鍵人才的留任率。 為健全組織活力，我們將深入解讀此人才流動指標，並配合員工回饋機制，著手優化整體薪酬待遇、心理諮商關懷服務、以及友善職場工作氛圍之建立，以維持穩定的勞動關係。</w:t>
       </w:r>
     </w:p>
     <w:p>
@@ -2316,7 +1680,7 @@
                 <w:rFonts w:ascii="Arial" w:hAnsi="Arial" w:eastAsia="Microsoft JhengHei"/>
                 <w:sz w:val="18"/>
               </w:rPr>
-              <w:t>三、 GRI 305 - 3.1.1 範疇一來源解讀</w:t>
+              <w:t>GRI 305 - 3.1.1 範疇一來源深度解讀</w:t>
             </w:r>
           </w:p>
         </w:tc>
@@ -2378,7 +1742,7 @@
                 <w:rFonts w:ascii="Arial" w:hAnsi="Arial" w:eastAsia="Microsoft JhengHei"/>
                 <w:sz w:val="18"/>
               </w:rPr>
-              <w:t>三、 GRI 305 - 3.1.2 範疇二電力分析</w:t>
+              <w:t>GRI 305 - 3.1.2 範疇二電力與減碳路徑</w:t>
             </w:r>
           </w:p>
         </w:tc>
@@ -2394,6 +1758,68 @@
                 <w:sz w:val="18"/>
               </w:rPr>
               <w:t>5</w:t>
+            </w:r>
+          </w:p>
+        </w:tc>
+      </w:tr>
+      <w:tr>
+        <w:tc>
+          <w:tcPr>
+            <w:tcW w:type="dxa" w:w="2340"/>
+          </w:tcPr>
+          <w:p>
+            <w:r>
+              <w:rPr>
+                <w:rFonts w:ascii="Arial" w:hAnsi="Arial"/>
+                <w:rFonts w:ascii="Arial" w:hAnsi="Arial" w:eastAsia="Microsoft JhengHei"/>
+                <w:sz w:val="18"/>
+              </w:rPr>
+              <w:t>GRI 305: Emissions 2016</w:t>
+            </w:r>
+          </w:p>
+        </w:tc>
+        <w:tc>
+          <w:tcPr>
+            <w:tcW w:type="dxa" w:w="2340"/>
+          </w:tcPr>
+          <w:p>
+            <w:r>
+              <w:rPr>
+                <w:rFonts w:ascii="Arial" w:hAnsi="Arial"/>
+                <w:rFonts w:ascii="Arial" w:hAnsi="Arial" w:eastAsia="Microsoft JhengHei"/>
+                <w:sz w:val="18"/>
+              </w:rPr>
+              <w:t>305-4 溫室氣體排放密集度/YoY成效</w:t>
+            </w:r>
+          </w:p>
+        </w:tc>
+        <w:tc>
+          <w:tcPr>
+            <w:tcW w:type="dxa" w:w="2340"/>
+          </w:tcPr>
+          <w:p>
+            <w:r>
+              <w:rPr>
+                <w:rFonts w:ascii="Arial" w:hAnsi="Arial"/>
+                <w:rFonts w:ascii="Arial" w:hAnsi="Arial" w:eastAsia="Microsoft JhengHei"/>
+                <w:sz w:val="18"/>
+              </w:rPr>
+              <w:t>GRI 305 - 3.1.3 YoY排放變動評估</w:t>
+            </w:r>
+          </w:p>
+        </w:tc>
+        <w:tc>
+          <w:tcPr>
+            <w:tcW w:type="dxa" w:w="2340"/>
+          </w:tcPr>
+          <w:p>
+            <w:r>
+              <w:rPr>
+                <w:rFonts w:ascii="Arial" w:hAnsi="Arial"/>
+                <w:rFonts w:ascii="Arial" w:hAnsi="Arial" w:eastAsia="Microsoft JhengHei"/>
+                <w:sz w:val="18"/>
+              </w:rPr>
+              <w:t>6</w:t>
             </w:r>
           </w:p>
         </w:tc>
@@ -2440,7 +1866,7 @@
                 <w:rFonts w:ascii="Arial" w:hAnsi="Arial" w:eastAsia="Microsoft JhengHei"/>
                 <w:sz w:val="18"/>
               </w:rPr>
-              <w:t>四、 GRI 404 - 4.1.1 培訓時數結構分析</w:t>
+              <w:t>GRI 404 - 4.1.1 培訓時數結構分析</w:t>
             </w:r>
           </w:p>
         </w:tc>
@@ -2502,7 +1928,7 @@
                 <w:rFonts w:ascii="Arial" w:hAnsi="Arial" w:eastAsia="Microsoft JhengHei"/>
                 <w:sz w:val="18"/>
               </w:rPr>
-              <w:t>四、 GRI 404 - 4.1.2 員工技能提升效益</w:t>
+              <w:t>GRI 404 - 4.1.2 技能提升與過渡計畫</w:t>
             </w:r>
           </w:p>
         </w:tc>
@@ -2518,6 +1944,68 @@
                 <w:sz w:val="18"/>
               </w:rPr>
               <w:t>7</w:t>
+            </w:r>
+          </w:p>
+        </w:tc>
+      </w:tr>
+      <w:tr>
+        <w:tc>
+          <w:tcPr>
+            <w:tcW w:type="dxa" w:w="2340"/>
+          </w:tcPr>
+          <w:p>
+            <w:r>
+              <w:rPr>
+                <w:rFonts w:ascii="Arial" w:hAnsi="Arial"/>
+                <w:rFonts w:ascii="Arial" w:hAnsi="Arial" w:eastAsia="Microsoft JhengHei"/>
+                <w:sz w:val="18"/>
+              </w:rPr>
+              <w:t>GRI 404: Training &amp; Education</w:t>
+            </w:r>
+          </w:p>
+        </w:tc>
+        <w:tc>
+          <w:tcPr>
+            <w:tcW w:type="dxa" w:w="2340"/>
+          </w:tcPr>
+          <w:p>
+            <w:r>
+              <w:rPr>
+                <w:rFonts w:ascii="Arial" w:hAnsi="Arial"/>
+                <w:rFonts w:ascii="Arial" w:hAnsi="Arial" w:eastAsia="Microsoft JhengHei"/>
+                <w:sz w:val="18"/>
+              </w:rPr>
+              <w:t>404-3 接受定期績效及職涯發展檢核</w:t>
+            </w:r>
+          </w:p>
+        </w:tc>
+        <w:tc>
+          <w:tcPr>
+            <w:tcW w:type="dxa" w:w="2340"/>
+          </w:tcPr>
+          <w:p>
+            <w:r>
+              <w:rPr>
+                <w:rFonts w:ascii="Arial" w:hAnsi="Arial"/>
+                <w:rFonts w:ascii="Arial" w:hAnsi="Arial" w:eastAsia="Microsoft JhengHei"/>
+                <w:sz w:val="18"/>
+              </w:rPr>
+              <w:t>GRI 404 - 4.1.3 組織人才穩定度</w:t>
+            </w:r>
+          </w:p>
+        </w:tc>
+        <w:tc>
+          <w:tcPr>
+            <w:tcW w:type="dxa" w:w="2340"/>
+          </w:tcPr>
+          <w:p>
+            <w:r>
+              <w:rPr>
+                <w:rFonts w:ascii="Arial" w:hAnsi="Arial"/>
+                <w:rFonts w:ascii="Arial" w:hAnsi="Arial" w:eastAsia="Microsoft JhengHei"/>
+                <w:sz w:val="18"/>
+              </w:rPr>
+              <w:t>8</w:t>
             </w:r>
           </w:p>
         </w:tc>

</xml_diff>